<commit_message>
feat:add new tab config rules
</commit_message>
<xml_diff>
--- a/files/hop-dong-mua-ban-ta/sales-contract-10-wrong.docx
+++ b/files/hop-dong-mua-ban-ta/sales-contract-10-wrong.docx
@@ -1765,7 +1765,7 @@
           <w:szCs w:val="24"/>
           <w:rtl w:val="0"/>
         </w:rPr>
-        <w:t xml:space="preserve">This Agreement may be terminated by either party or both Parties at any instant provided that the terminating party provides a written notice of termination days in advance.</w:t>
+        <w:t xml:space="preserve">This Agreement may be terminated by either party or both Parties at any instant provided that the terminating party provides a written notice of termination …. days in advance.</w:t>
       </w:r>
       <w:r>
         <w:rPr>
@@ -3272,7 +3272,7 @@
 
 <file path=customXML/item1.xml><?xml version="1.0" encoding="utf-8"?>
 <go:gDocsCustomXmlDataStorage xmlns:go="http://customooxmlschemas.google.com/" xmlns:r="http://schemas.openxmlformats.org/officeDocument/2006/relationships" uri="GoogleDocsCustomDataVersion2">
-  <go:docsCustomData xmlns:go="http://customooxmlschemas.google.com/" roundtripDataSignature="AMtx7mjeuNoFQ3BNMelLAzFkXnDmysGDeA==">CgMxLjA4AHIhMXNwaGprMnlLZEE2cTVSX0d2TXhhM3duRmFaX3FaMVNs</go:docsCustomData>
+  <go:docsCustomData xmlns:go="http://customooxmlschemas.google.com/" roundtripDataSignature="AMtx7miEjST+XYQypCAC1laizo5Wl/ywoA==">CgMxLjA4AHIhMWVBNDIwdS1lTHZIWHJlSlJMN2tla0JRYks4WFlPeWJW</go:docsCustomData>
 </go:gDocsCustomXmlDataStorage>
 </file>
 

</xml_diff>